<commit_message>
fix(reports): corrige dados de assinatura e renderização de NCs
</commit_message>
<xml_diff>
--- a/scratch/test_out/relatorio_2026-001.docx
+++ b/scratch/test_out/relatorio_2026-001.docx
@@ -39,7 +39,7 @@
           <w:b/>
           <w:sz w:val="24"/>
         </w:rPr>
-        <w:t>RELATÓRIO DO 2º MONITORAMENTO DO PROCESSO</w:t>
+        <w:t>RELATÓRIO DO Xº MONITORAMENTO DO PROCESSO</w:t>
       </w:r>
     </w:p>
     <w:p>
@@ -53,7 +53,7 @@
           <w:b/>
           <w:sz w:val="24"/>
         </w:rPr>
-        <w:t>DE FISCALIZAÇÃO TÉCNICO-OPERACIONAL CTR Nº 07/2025</w:t>
+        <w:t>DE FISCALIZAÇÃO TÉCNICO-OPERACIONAL CTR Nº XX/XXXX</w:t>
       </w:r>
     </w:p>
     <w:p>
@@ -98,20 +98,6 @@
     </w:p>
     <w:p>
       <w:pPr>
-        <w:spacing w:after="80" w:before="0" w:line="276" w:lineRule="auto"/>
-        <w:jc w:val="center"/>
-      </w:pPr>
-      <w:r>
-        <w:rPr>
-          <w:rFonts w:ascii="Aptos" w:hAnsi="Aptos"/>
-          <w:b/>
-          <w:sz w:val="22"/>
-        </w:rPr>
-        <w:t>VISTORIA TÉCNICA DAS NÃO CONFORMIDADES REGISTRADAS NO</w:t>
-      </w:r>
-    </w:p>
-    <w:p>
-      <w:pPr>
         <w:spacing w:after="120" w:before="0" w:line="276" w:lineRule="auto"/>
         <w:jc w:val="center"/>
       </w:pPr>
@@ -121,7 +107,7 @@
           <w:b/>
           <w:sz w:val="22"/>
         </w:rPr>
-        <w:t>RELATÓRIO DE FISCALIZAÇÃO TÉCNICO-OPERACIONAL CTR 07/2025</w:t>
+        <w:t>VISTORIA TÉCNICA SOBRE AS NÃO CONFORMIDADES APONTADAS NO RELATÓRIO DE FISCALIZAÇÃO TÉCNICO-OPERACIONAL CTR XX/XXXX.</w:t>
       </w:r>
     </w:p>
     <w:p>
@@ -141,7 +127,21 @@
           <w:b/>
           <w:sz w:val="22"/>
         </w:rPr>
-        <w:t>CONTRATO DE CONCESSÃO PARA A EXPLORAÇÃO DO COMPLEXO</w:t>
+        <w:t>CONTRATO DE CONCESSÃO PATROCINADA – CGPE Nº 001/2006</w:t>
+      </w:r>
+    </w:p>
+    <w:p>
+      <w:pPr>
+        <w:spacing w:after="80" w:before="0" w:line="276" w:lineRule="auto"/>
+        <w:jc w:val="center"/>
+      </w:pPr>
+      <w:r>
+        <w:rPr>
+          <w:rFonts w:ascii="Aptos" w:hAnsi="Aptos"/>
+          <w:b/>
+          <w:sz w:val="22"/>
+        </w:rPr>
+        <w:t>EXPLORAÇÃO DA PONTE DE ACESSO E SISTEMA VIÁRIO</w:t>
       </w:r>
     </w:p>
     <w:p>
@@ -155,7 +155,7 @@
           <w:b/>
           <w:sz w:val="22"/>
         </w:rPr>
-        <w:t>VIÁRIO E LOGÍSTICO DE SUAPE – EXPRESS WAY - CT Nº 043/2011</w:t>
+        <w:t>DO DESTINO DE TURISMO E LAZER PRAIA DO PAIVA</w:t>
       </w:r>
     </w:p>
     <w:p>
@@ -175,7 +175,7 @@
           <w:b/>
           <w:sz w:val="22"/>
         </w:rPr>
-        <w:t>PROCESSO SEI Nº 0030200023.009194/2025-85</w:t>
+        <w:t>PROCESSO SEI Nº 0030200023.004570/2025-45</w:t>
       </w:r>
     </w:p>
     <w:p>
@@ -374,99 +374,7 @@
                 <w:b/>
                 <w:sz w:val="22"/>
               </w:rPr>
-              <w:t>RESULTADOS DAS VISTORIAS DAS NÃO CONFORMIDADES – ABRIL, 2026</w:t>
-            </w:r>
-            <w:r>
-              <w:tab/>
-            </w:r>
-            <w:r>
-              <w:rPr>
-                <w:rFonts w:ascii="Aptos" w:hAnsi="Aptos"/>
-                <w:b/>
-                <w:sz w:val="22"/>
-              </w:rPr>
-              <w:t>5</w:t>
-            </w:r>
-          </w:hyperlink>
-        </w:p>
-        <w:p>
-          <w:pPr>
-            <w:pStyle w:val="Sumrio3"/>
-            <w:tabs>
-              <w:tab w:val="left" w:pos="960"/>
-              <w:tab w:val="right" w:leader="dot" w:pos="10456"/>
-            </w:tabs>
-            <w:rPr>
-              <w:rFonts w:ascii="Aptos" w:hAnsi="Aptos"/>
-              <w:sz w:val="22"/>
-              <w:szCs w:val="22"/>
-            </w:rPr>
-          </w:pPr>
-          <w:hyperlink w:history="1">
-            <w:r>
-              <w:rPr>
-                <w:rFonts w:ascii="Aptos" w:hAnsi="Aptos"/>
-                <w:b/>
-                <w:sz w:val="22"/>
-              </w:rPr>
-              <w:t>3.1</w:t>
-            </w:r>
-            <w:r>
-              <w:tab/>
-            </w:r>
-            <w:r>
-              <w:rPr>
-                <w:rFonts w:ascii="Aptos" w:hAnsi="Aptos"/>
-                <w:b/>
-                <w:sz w:val="22"/>
-              </w:rPr>
-              <w:t>RODOVIA ESTADUAL PE - 009, PISTA SENTIDO SUL</w:t>
-            </w:r>
-            <w:r>
-              <w:tab/>
-            </w:r>
-            <w:r>
-              <w:rPr>
-                <w:rFonts w:ascii="Aptos" w:hAnsi="Aptos"/>
-                <w:b/>
-                <w:sz w:val="22"/>
-              </w:rPr>
-              <w:t>5</w:t>
-            </w:r>
-          </w:hyperlink>
-        </w:p>
-        <w:p>
-          <w:pPr>
-            <w:pStyle w:val="Sumrio3"/>
-            <w:tabs>
-              <w:tab w:val="left" w:pos="960"/>
-              <w:tab w:val="right" w:leader="dot" w:pos="10456"/>
-            </w:tabs>
-            <w:rPr>
-              <w:rFonts w:ascii="Aptos" w:hAnsi="Aptos"/>
-              <w:sz w:val="22"/>
-              <w:szCs w:val="22"/>
-            </w:rPr>
-          </w:pPr>
-          <w:hyperlink w:history="1">
-            <w:r>
-              <w:rPr>
-                <w:rFonts w:ascii="Aptos" w:hAnsi="Aptos"/>
-                <w:b/>
-                <w:sz w:val="22"/>
-              </w:rPr>
-              <w:t>3.2</w:t>
-            </w:r>
-            <w:r>
-              <w:tab/>
-            </w:r>
-            <w:r>
-              <w:rPr>
-                <w:rFonts w:ascii="Aptos" w:hAnsi="Aptos"/>
-                <w:b/>
-                <w:sz w:val="22"/>
-              </w:rPr>
-              <w:t>RODOVIA ESTADUAL PE - 009, PISTA SENTIDO NORTE</w:t>
+              <w:t>RESULTADOS DAS VISTORIAS DAS NÃO CONFORMIDADES</w:t>
             </w:r>
             <w:r>
               <w:tab/>
@@ -512,7 +420,7 @@
                 <w:b/>
                 <w:sz w:val="22"/>
               </w:rPr>
-              <w:t>RESUMO DA SITUAÇÃO DAS NÃO CONFORMIDADES MONITORADAS (ABRIL, 2026)</w:t>
+              <w:t>RESUMO DA SITUAÇÃO DAS NÃO CONFORMIDADES MONITORADAS (JUNHO, 2026)</w:t>
             </w:r>
             <w:r>
               <w:tab/>
@@ -593,7 +501,7 @@
                 <w:b/>
                 <w:sz w:val="22"/>
               </w:rPr>
-              <w:t>APÊNDICE - MEMORIAL FOTOGRÁFICO - VISTORIAS REALIZADAS EM ABRIL, 2026</w:t>
+              <w:t>APÊNDÍCE ÚNCO - MEMORIAL FOTOGRÁFICO - JUNHO, 2026</w:t>
             </w:r>
             <w:r>
               <w:tab/>
@@ -656,7 +564,7 @@
           <w:b w:val="0"/>
           <w:sz w:val="22"/>
         </w:rPr>
-        <w:t>Registra-se, preliminarmente, que o Relatório de Fiscalização Técnico-Operacional ARPE/CTR 07/2025 registrou as Não Conformidades identificadas e foi devidamente encaminhado à Concessionária Rota do Atlântico (CRA) e aos órgãos concedentes para as providências cabíveis.</w:t>
+        <w:t>Registra-se, preliminarmente, que na última vistoria técnica de monitoramento das Não Conformidades apontadas no Relatório de Fiscalização Técnico-Operacional CTR XX/XXXX, realizada na Rodovia Rota dos Coqueiros em XX/XX/XXXX, verificou-se que X Não Conformidades restavam pendentes. Assim, o Relatório do Xº Monitoramento (Doc. SEI nº XXXXXXXX) foi encaminhado à Concessionária Rota dos Coqueiros (CRC) pelo Ofício Arpe DTO nº xxx/xxxx, de xx/xx/xxxx, reforçando a recomendação para que a Concessionária mantenha a ARPE informada sobre as tratativas referentes às não conformidades pendentes.</w:t>
       </w:r>
     </w:p>
     <w:p>
@@ -670,21 +578,7 @@
           <w:b w:val="0"/>
           <w:sz w:val="22"/>
         </w:rPr>
-        <w:t>A Concessionária Rota do Atlântico (CRA) apresentou o cronograma de obras atualizado por trecho, com detalhamento dos prazos de execução das ações de conservação especial do pavimento e sinalização viária.</w:t>
-      </w:r>
-    </w:p>
-    <w:p>
-      <w:pPr>
-        <w:spacing w:after="120" w:line="276" w:lineRule="auto"/>
-        <w:jc w:val="both"/>
-      </w:pPr>
-      <w:r>
-        <w:rPr>
-          <w:rFonts w:ascii="Aptos" w:hAnsi="Aptos"/>
-          <w:b w:val="0"/>
-          <w:sz w:val="22"/>
-        </w:rPr>
-        <w:t>Neste contexto, este 2º Relatório de Monitoramento descreve a evolução das Não Conformidades apontadas, com base nas vistorias técnicas realizadas pela equipe da ARPE em 15 de abril de 2026 no Sistema Viário Express Way.</w:t>
+        <w:t>Em sequência, a Concessionária, por meio da Carta CRC/REG nº xxxx/xxxx, de xx/xx/xxxx (Doc. SEI nº xxxxxxxx), enviou sua manifestação informando as ações tomadas referentes às Não Conformidades pendentes.</w:t>
       </w:r>
     </w:p>
     <w:p>
@@ -714,7 +608,7 @@
           <w:b w:val="0"/>
           <w:sz w:val="22"/>
         </w:rPr>
-        <w:t>Este 2º Relatório de Monitoramento tem como objetivo apresentar os resultados das vistorias realizadas pela ARPE, em 15/04/2026, no Sistema Viário Express Way referentes às Não Conformidades constantes do Relatório de Fiscalização Técnico-Operacional ARPE/CTR 07/2025.</w:t>
+        <w:t>Este Xº Relatório de Monitoramento da ARPE tem como objetivo informar sobre o acompanhamento das ações da CRC referentes às Não Conformidades pendentes do Relatório de Fiscalização Técnico-Operacional ARPE/CTR XX/XXXX, de 27/05/2025, conforme as vistorias técnicas realizadas em 15 de junho de 2026, considerando também o posicionamento da Concessionária encaminhado à ARPE por meio da referida Carta CRC/REG nº xxxx/xxxx.</w:t>
       </w:r>
     </w:p>
     <w:p>
@@ -729,7 +623,7 @@
           <w:color w:val="000000"/>
           <w:sz w:val="24"/>
         </w:rPr>
-        <w:t>3. RESULTADOS DAS VISTORIAS DAS NÃO CONFORMIDADES – ABRIL, 2026</w:t>
+        <w:t>3. RESULTADOS DAS VISTORIAS DAS NÃO CONFORMIDADES</w:t>
       </w:r>
     </w:p>
     <w:p/>
@@ -744,7 +638,7 @@
           <w:b w:val="0"/>
           <w:sz w:val="22"/>
         </w:rPr>
-        <w:t>Apresenta-se a seguir a análise das constatações resultantes das vistorias técnicas das Não Conformidades associadas ao Relatório de Fiscalização Técnico-Operacional ARPE/CTR 07/2025, considerando o Cronograma das Obras por Trecho e o posicionamento apresentado pela Concessionária Rota do Atlântico (CRA).</w:t>
+        <w:t>Apresentam-se os resultados das vistorias técnicas realizadas em 15 de junho de 2026 na Rodovia Estadual PE-024 referentes às Não Conformidades (NC) registradas no Relatório de Fiscalização Técnico-Operacional ARPE/CTR nº XX/XXXX, organizadas em subitens pelo sentido da pista, associadas a cada Segmento Homogêneo (SH) com indicação do ponto fiscalizado (KM).</w:t>
       </w:r>
     </w:p>
     <w:p>
@@ -759,7 +653,7 @@
           <w:color w:val="000000"/>
           <w:sz w:val="24"/>
         </w:rPr>
-        <w:t>3.1 RODOVIA ESTADUAL PE - 009, PISTA SENTIDO SUL</w:t>
+        <w:t>3.1 RODOVIA ESTADUAL PE – 024 - PISTA ÚNICA</w:t>
       </w:r>
     </w:p>
     <w:p/>
@@ -774,7 +668,7 @@
           <w:b/>
           <w:sz w:val="22"/>
         </w:rPr>
-        <w:t>CRA.ST601.2794-2834/2025.013 - TRINCAS INTERLIGADAS</w:t>
+        <w:t>NC.001</w:t>
       </w:r>
     </w:p>
     <w:p>
@@ -788,14 +682,35 @@
           <w:b/>
           <w:sz w:val="22"/>
         </w:rPr>
-        <w:t xml:space="preserve">POSICIONAMENTO CRA: </w:t>
+        <w:t xml:space="preserve">NÃO CONFORMIDADE: </w:t>
       </w:r>
       <w:r>
         <w:rPr>
           <w:rFonts w:ascii="Aptos" w:hAnsi="Aptos"/>
           <w:sz w:val="22"/>
         </w:rPr>
-        <w:t>A CRA informou no cronograma...</w:t>
+        <w:t>Desgaste</w:t>
+      </w:r>
+    </w:p>
+    <w:p>
+      <w:pPr>
+        <w:spacing w:after="80" w:line="276" w:lineRule="auto"/>
+        <w:jc w:val="both"/>
+      </w:pPr>
+      <w:r>
+        <w:rPr>
+          <w:rFonts w:ascii="Aptos" w:hAnsi="Aptos"/>
+          <w:b/>
+          <w:sz w:val="22"/>
+        </w:rPr>
+        <w:t xml:space="preserve">POSICIONAMENTO DA CRC: </w:t>
+      </w:r>
+      <w:r>
+        <w:rPr>
+          <w:rFonts w:ascii="Aptos" w:hAnsi="Aptos"/>
+          <w:sz w:val="22"/>
+        </w:rPr>
+        <w:t>Reparar</w:t>
       </w:r>
     </w:p>
     <w:p>
@@ -816,7 +731,7 @@
           <w:rFonts w:ascii="Aptos" w:hAnsi="Aptos"/>
           <w:sz w:val="22"/>
         </w:rPr>
-        <w:t>Trincas interligadas (J) com erosão acentuada nas bordas das trincas (JE) e afundamento de trilha de rodas (ACT) no pavimento da faixa de rolamento direita.</w:t>
+        <w:t>A ser preenchido.</w:t>
       </w:r>
     </w:p>
     <w:p>
@@ -837,163 +752,7 @@
           <w:rFonts w:ascii="Aptos" w:hAnsi="Aptos"/>
           <w:sz w:val="22"/>
         </w:rPr>
-        <w:t>Não Conformidade Pendente.</w:t>
-      </w:r>
-    </w:p>
-    <w:p/>
-    <w:p>
-      <w:pPr>
-        <w:spacing w:after="120" w:line="276" w:lineRule="auto"/>
-        <w:jc w:val="both"/>
-      </w:pPr>
-      <w:r>
-        <w:rPr>
-          <w:rFonts w:ascii="Aptos" w:hAnsi="Aptos"/>
-          <w:b/>
-          <w:sz w:val="22"/>
-        </w:rPr>
-        <w:t>CRA.ST605.3212-3230/2025.014</w:t>
-      </w:r>
-    </w:p>
-    <w:p>
-      <w:pPr>
-        <w:spacing w:after="80" w:line="276" w:lineRule="auto"/>
-        <w:jc w:val="both"/>
-      </w:pPr>
-      <w:r>
-        <w:rPr>
-          <w:rFonts w:ascii="Aptos" w:hAnsi="Aptos"/>
-          <w:b/>
-          <w:sz w:val="22"/>
-        </w:rPr>
-        <w:t xml:space="preserve">POSICIONAMENTO CRA: </w:t>
-      </w:r>
-      <w:r>
-        <w:rPr>
-          <w:rFonts w:ascii="Aptos" w:hAnsi="Aptos"/>
-          <w:sz w:val="22"/>
-        </w:rPr>
-        <w:t>A CRA informou no cronograma...</w:t>
-      </w:r>
-    </w:p>
-    <w:p>
-      <w:pPr>
-        <w:spacing w:after="80" w:line="276" w:lineRule="auto"/>
-        <w:jc w:val="both"/>
-      </w:pPr>
-      <w:r>
-        <w:rPr>
-          <w:rFonts w:ascii="Aptos" w:hAnsi="Aptos"/>
-          <w:b/>
-          <w:sz w:val="22"/>
-        </w:rPr>
-        <w:t xml:space="preserve">CONSTATAÇÃO: </w:t>
-      </w:r>
-      <w:r>
-        <w:rPr>
-          <w:rFonts w:ascii="Aptos" w:hAnsi="Aptos"/>
-          <w:sz w:val="22"/>
-        </w:rPr>
-        <w:t>3230/2025.014: Trincas longitudinais (TLL), Trincas interligadas e afundamento de trilha de rodas (ATC) no pavimento da faixa de rolamento direita.</w:t>
-      </w:r>
-    </w:p>
-    <w:p>
-      <w:pPr>
-        <w:spacing w:after="80" w:line="276" w:lineRule="auto"/>
-        <w:jc w:val="both"/>
-      </w:pPr>
-      <w:r>
-        <w:rPr>
-          <w:rFonts w:ascii="Aptos" w:hAnsi="Aptos"/>
-          <w:b/>
-          <w:sz w:val="22"/>
-        </w:rPr>
-        <w:t xml:space="preserve">ANÁLISE ARPE: </w:t>
-      </w:r>
-      <w:r>
-        <w:rPr>
-          <w:rFonts w:ascii="Aptos" w:hAnsi="Aptos"/>
-          <w:sz w:val="22"/>
-        </w:rPr>
-        <w:t>Não Conformidade Pendente.</w:t>
-      </w:r>
-    </w:p>
-    <w:p/>
-    <w:p>
-      <w:pPr>
-        <w:spacing w:after="120" w:line="276" w:lineRule="auto"/>
-        <w:jc w:val="both"/>
-      </w:pPr>
-      <w:r>
-        <w:rPr>
-          <w:rFonts w:ascii="Aptos" w:hAnsi="Aptos"/>
-          <w:b/>
-          <w:sz w:val="22"/>
-        </w:rPr>
-        <w:t>CRA.ST607.3550-3562 /2025.015</w:t>
-      </w:r>
-    </w:p>
-    <w:p>
-      <w:pPr>
-        <w:spacing w:after="80" w:line="276" w:lineRule="auto"/>
-        <w:jc w:val="both"/>
-      </w:pPr>
-      <w:r>
-        <w:rPr>
-          <w:rFonts w:ascii="Aptos" w:hAnsi="Aptos"/>
-          <w:b/>
-          <w:sz w:val="22"/>
-        </w:rPr>
-        <w:t xml:space="preserve">POSICIONAMENTO CRA: </w:t>
-      </w:r>
-      <w:r>
-        <w:rPr>
-          <w:rFonts w:ascii="Aptos" w:hAnsi="Aptos"/>
-          <w:sz w:val="22"/>
-        </w:rPr>
-        <w:t>A CRA informou no cronograma...</w:t>
-      </w:r>
-    </w:p>
-    <w:p>
-      <w:pPr>
-        <w:spacing w:after="80" w:line="276" w:lineRule="auto"/>
-        <w:jc w:val="both"/>
-      </w:pPr>
-      <w:r>
-        <w:rPr>
-          <w:rFonts w:ascii="Aptos" w:hAnsi="Aptos"/>
-          <w:b/>
-          <w:sz w:val="22"/>
-        </w:rPr>
-        <w:t xml:space="preserve">CONSTATAÇÃO: </w:t>
-      </w:r>
-      <w:r>
-        <w:rPr>
-          <w:rFonts w:ascii="Aptos" w:hAnsi="Aptos"/>
-          <w:sz w:val="22"/>
-        </w:rPr>
-        <w:t>3562 /2025.015: Pavimento sobre a Junta de dilatação na via sobre o cruzamento com a PE 028 deteriorado e com falhas que possibilitam infiltrações.</w:t>
-      </w:r>
-    </w:p>
-    <w:p>
-      <w:pPr>
-        <w:spacing w:after="80" w:line="276" w:lineRule="auto"/>
-        <w:jc w:val="both"/>
-      </w:pPr>
-      <w:r>
-        <w:rPr>
-          <w:rFonts w:ascii="Aptos" w:hAnsi="Aptos"/>
-          <w:b/>
-          <w:sz w:val="22"/>
-        </w:rPr>
-        <w:t xml:space="preserve">ANÁLISE ARPE: </w:t>
-      </w:r>
-      <w:r>
-        <w:rPr>
-          <w:rFonts w:ascii="Aptos" w:hAnsi="Aptos"/>
-          <w:sz w:val="22"/>
-        </w:rPr>
-        <w:t>Não Conformidade Pendente.</w:t>
+        <w:t>A ser preenchido.</w:t>
       </w:r>
     </w:p>
     <w:p/>
@@ -1009,7 +768,7 @@
           <w:color w:val="000000"/>
           <w:sz w:val="24"/>
         </w:rPr>
-        <w:t>4. RESUMO DA SITUAÇÃO DAS NÃO CONFORMIDADES MONITORADAS (ABRIL, 2026)</w:t>
+        <w:t>4. RESUMO DA SITUAÇÃO DAS NÃO CONFORMIDADES MONITORADAS (JUNHO, 2026)</w:t>
       </w:r>
     </w:p>
     <w:p/>
@@ -1024,7 +783,7 @@
           <w:b w:val="0"/>
           <w:sz w:val="22"/>
         </w:rPr>
-        <w:t>Apresenta-se no Quadro 1, a seguir, um resumo da situação das Não Conformidades registradas no Relatório de Fiscalização Técnico-Operacional ARPE/CTR 07/2025, de acordo com as vistorias realizadas em 15/04/2026, em continuidade às diligências necessárias ao monitoramento das respectivas soluções.</w:t>
+        <w:t>Apresenta-se no Quadro 1, a seguir, um resumo da situação das Não Conformidades pendentes do Relatório ARPE/CTR nº XX/XXXX, de acordo com as vistorias técnicas realizadas em 15/06/2026, dando continuidade ao monitoramento das respectivas soluções.</w:t>
       </w:r>
     </w:p>
     <w:p>
@@ -1046,7 +805,7 @@
           <w:b/>
           <w:sz w:val="22"/>
         </w:rPr>
-        <w:t xml:space="preserve"> – Resumo da Situação das Não Conformidades – Abril, 2026</w:t>
+        <w:t xml:space="preserve"> – Situação das Não Conformidades Relatório ARPE/CTR Nº XX/XXXX</w:t>
       </w:r>
     </w:p>
     <w:tbl>
@@ -1073,7 +832,7 @@
       <w:tr>
         <w:tc>
           <w:tcPr>
-            <w:tcW w:type="dxa" w:w="2592"/>
+            <w:tcW w:type="dxa" w:w="1656"/>
             <w:shd w:val="clear" w:color="auto" w:fill="BFBFBF"/>
             <w:tcMar>
               <w:top w:w="100" w:type="dxa"/>
@@ -1094,13 +853,13 @@
                 <w:b/>
                 <w:sz w:val="20"/>
               </w:rPr>
-              <w:t>REFERÊNCIA</w:t>
+              <w:t>ID.NC(*)</w:t>
             </w:r>
           </w:p>
         </w:tc>
         <w:tc>
           <w:tcPr>
-            <w:tcW w:type="dxa" w:w="6048"/>
+            <w:tcW w:type="dxa" w:w="5184"/>
             <w:shd w:val="clear" w:color="auto" w:fill="BFBFBF"/>
             <w:tcMar>
               <w:top w:w="100" w:type="dxa"/>
@@ -1121,13 +880,13 @@
                 <w:b/>
                 <w:sz w:val="20"/>
               </w:rPr>
-              <w:t>CONSTATAÇÃO / NÃO CONFORMIDADE RELATÓRIO ARPE/CTR 07/2025</w:t>
+              <w:t>CONSTATAÇÃO (27/05/2025)</w:t>
             </w:r>
           </w:p>
         </w:tc>
         <w:tc>
           <w:tcPr>
-            <w:tcW w:type="dxa" w:w="2261"/>
+            <w:tcW w:type="dxa" w:w="1526"/>
             <w:shd w:val="clear" w:color="auto" w:fill="BFBFBF"/>
             <w:tcMar>
               <w:top w:w="100" w:type="dxa"/>
@@ -1148,7 +907,7 @@
                 <w:b/>
                 <w:sz w:val="20"/>
               </w:rPr>
-              <w:t>SITUAÇÃO</w:t>
+              <w:t>SITUAÇÃO 15/06/2026</w:t>
             </w:r>
           </w:p>
         </w:tc>
@@ -1156,57 +915,7 @@
       <w:tr>
         <w:tc>
           <w:tcPr>
-            <w:tcW w:type="dxa" w:w="2592"/>
-            <w:tcMar>
-              <w:top w:w="100" w:type="dxa"/>
-              <w:bottom w:w="100" w:type="dxa"/>
-              <w:left w:w="150" w:type="dxa"/>
-              <w:right w:w="150" w:type="dxa"/>
-            </w:tcMar>
-            <w:vAlign w:val="center"/>
-          </w:tcPr>
-          <w:p>
-            <w:pPr>
-              <w:spacing w:before="0" w:after="0" w:line="276" w:lineRule="auto"/>
-              <w:jc w:val="left"/>
-            </w:pPr>
-            <w:r>
-              <w:rPr>
-                <w:rFonts w:ascii="Aptos" w:hAnsi="Aptos"/>
-                <w:sz w:val="20"/>
-              </w:rPr>
-              <w:t>CRA.ST601.2794-2834/2025.013</w:t>
-            </w:r>
-          </w:p>
-        </w:tc>
-        <w:tc>
-          <w:tcPr>
-            <w:tcW w:type="dxa" w:w="6048"/>
-            <w:tcMar>
-              <w:top w:w="100" w:type="dxa"/>
-              <w:bottom w:w="100" w:type="dxa"/>
-              <w:left w:w="150" w:type="dxa"/>
-              <w:right w:w="150" w:type="dxa"/>
-            </w:tcMar>
-            <w:vAlign w:val="center"/>
-          </w:tcPr>
-          <w:p>
-            <w:pPr>
-              <w:spacing w:before="0" w:after="0" w:line="276" w:lineRule="auto"/>
-              <w:jc w:val="left"/>
-            </w:pPr>
-            <w:r>
-              <w:rPr>
-                <w:rFonts w:ascii="Aptos" w:hAnsi="Aptos"/>
-                <w:sz w:val="20"/>
-              </w:rPr>
-              <w:t>Trincas interligadas (J) com erosão acentuada nas bordas das trincas (JE) e afundamento de trilha de rodas (ACT) no pavimento da faixa de rolamento direita.</w:t>
-            </w:r>
-          </w:p>
-        </w:tc>
-        <w:tc>
-          <w:tcPr>
-            <w:tcW w:type="dxa" w:w="2261"/>
+            <w:tcW w:type="dxa" w:w="1656"/>
             <w:tcMar>
               <w:top w:w="100" w:type="dxa"/>
               <w:bottom w:w="100" w:type="dxa"/>
@@ -1226,15 +935,13 @@
                 <w:b/>
                 <w:sz w:val="20"/>
               </w:rPr>
-              <w:t>PENDENTE</w:t>
+              <w:t>NC.001</w:t>
             </w:r>
           </w:p>
         </w:tc>
-      </w:tr>
-      <w:tr>
         <w:tc>
           <w:tcPr>
-            <w:tcW w:type="dxa" w:w="2592"/>
+            <w:tcW w:type="dxa" w:w="5184"/>
             <w:tcMar>
               <w:top w:w="100" w:type="dxa"/>
               <w:bottom w:w="100" w:type="dxa"/>
@@ -1253,38 +960,13 @@
                 <w:rFonts w:ascii="Aptos" w:hAnsi="Aptos"/>
                 <w:sz w:val="20"/>
               </w:rPr>
-              <w:t>CRA.ST605.3212-3230 /2025.014</w:t>
+              <w:t>Desgaste</w:t>
             </w:r>
           </w:p>
         </w:tc>
         <w:tc>
           <w:tcPr>
-            <w:tcW w:type="dxa" w:w="6048"/>
-            <w:tcMar>
-              <w:top w:w="100" w:type="dxa"/>
-              <w:bottom w:w="100" w:type="dxa"/>
-              <w:left w:w="150" w:type="dxa"/>
-              <w:right w:w="150" w:type="dxa"/>
-            </w:tcMar>
-            <w:vAlign w:val="center"/>
-          </w:tcPr>
-          <w:p>
-            <w:pPr>
-              <w:spacing w:before="0" w:after="0" w:line="276" w:lineRule="auto"/>
-              <w:jc w:val="left"/>
-            </w:pPr>
-            <w:r>
-              <w:rPr>
-                <w:rFonts w:ascii="Aptos" w:hAnsi="Aptos"/>
-                <w:sz w:val="20"/>
-              </w:rPr>
-              <w:t>Trincas longitudinais (TLL), Trincas interligadas e afundamento de trilha de rodas (ATC) no pavimento da faixa de rolamento direita.</w:t>
-            </w:r>
-          </w:p>
-        </w:tc>
-        <w:tc>
-          <w:tcPr>
-            <w:tcW w:type="dxa" w:w="2261"/>
+            <w:tcW w:type="dxa" w:w="1526"/>
             <w:tcMar>
               <w:top w:w="100" w:type="dxa"/>
               <w:bottom w:w="100" w:type="dxa"/>
@@ -1304,949 +986,27 @@
                 <w:b/>
                 <w:sz w:val="20"/>
               </w:rPr>
-              <w:t>PENDENTE</w:t>
-            </w:r>
-          </w:p>
-        </w:tc>
-      </w:tr>
-      <w:tr>
-        <w:tc>
-          <w:tcPr>
-            <w:tcW w:type="dxa" w:w="2592"/>
-            <w:tcMar>
-              <w:top w:w="100" w:type="dxa"/>
-              <w:bottom w:w="100" w:type="dxa"/>
-              <w:left w:w="150" w:type="dxa"/>
-              <w:right w:w="150" w:type="dxa"/>
-            </w:tcMar>
-            <w:vAlign w:val="center"/>
-          </w:tcPr>
-          <w:p>
-            <w:pPr>
-              <w:spacing w:before="0" w:after="0" w:line="276" w:lineRule="auto"/>
-              <w:jc w:val="left"/>
-            </w:pPr>
-            <w:r>
-              <w:rPr>
-                <w:rFonts w:ascii="Aptos" w:hAnsi="Aptos"/>
-                <w:sz w:val="20"/>
-              </w:rPr>
-              <w:t>CRA.ST607.3550-3562/2025.015</w:t>
-            </w:r>
-          </w:p>
-        </w:tc>
-        <w:tc>
-          <w:tcPr>
-            <w:tcW w:type="dxa" w:w="6048"/>
-            <w:tcMar>
-              <w:top w:w="100" w:type="dxa"/>
-              <w:bottom w:w="100" w:type="dxa"/>
-              <w:left w:w="150" w:type="dxa"/>
-              <w:right w:w="150" w:type="dxa"/>
-            </w:tcMar>
-            <w:vAlign w:val="center"/>
-          </w:tcPr>
-          <w:p>
-            <w:pPr>
-              <w:spacing w:before="0" w:after="0" w:line="276" w:lineRule="auto"/>
-              <w:jc w:val="left"/>
-            </w:pPr>
-            <w:r>
-              <w:rPr>
-                <w:rFonts w:ascii="Aptos" w:hAnsi="Aptos"/>
-                <w:sz w:val="20"/>
-              </w:rPr>
-              <w:t>Pavimento sobre a Junta de dilatação na via sobre o cruzamento com a PE 028 deteriorado e com falhas que possibilitam infiltrações.</w:t>
-            </w:r>
-          </w:p>
-        </w:tc>
-        <w:tc>
-          <w:tcPr>
-            <w:tcW w:type="dxa" w:w="2261"/>
-            <w:tcMar>
-              <w:top w:w="100" w:type="dxa"/>
-              <w:bottom w:w="100" w:type="dxa"/>
-              <w:left w:w="150" w:type="dxa"/>
-              <w:right w:w="150" w:type="dxa"/>
-            </w:tcMar>
-            <w:vAlign w:val="center"/>
-          </w:tcPr>
-          <w:p>
-            <w:pPr>
-              <w:spacing w:before="0" w:after="0"/>
-              <w:jc w:val="center"/>
-            </w:pPr>
-            <w:r>
-              <w:rPr>
-                <w:rFonts w:ascii="Aptos" w:hAnsi="Aptos"/>
-                <w:b/>
-                <w:sz w:val="20"/>
-              </w:rPr>
-              <w:t>PENDENTE</w:t>
-            </w:r>
-          </w:p>
-        </w:tc>
-      </w:tr>
-      <w:tr>
-        <w:tc>
-          <w:tcPr>
-            <w:tcW w:type="dxa" w:w="2592"/>
-            <w:tcMar>
-              <w:top w:w="100" w:type="dxa"/>
-              <w:bottom w:w="100" w:type="dxa"/>
-              <w:left w:w="150" w:type="dxa"/>
-              <w:right w:w="150" w:type="dxa"/>
-            </w:tcMar>
-            <w:vAlign w:val="center"/>
-          </w:tcPr>
-          <w:p>
-            <w:pPr>
-              <w:spacing w:before="0" w:after="0" w:line="276" w:lineRule="auto"/>
-              <w:jc w:val="left"/>
-            </w:pPr>
-            <w:r>
-              <w:rPr>
-                <w:rFonts w:ascii="Aptos" w:hAnsi="Aptos"/>
-                <w:sz w:val="20"/>
-              </w:rPr>
-              <w:t>CRA.ST405.3958-3988/2025.016</w:t>
-            </w:r>
-          </w:p>
-        </w:tc>
-        <w:tc>
-          <w:tcPr>
-            <w:tcW w:type="dxa" w:w="6048"/>
-            <w:tcMar>
-              <w:top w:w="100" w:type="dxa"/>
-              <w:bottom w:w="100" w:type="dxa"/>
-              <w:left w:w="150" w:type="dxa"/>
-              <w:right w:w="150" w:type="dxa"/>
-            </w:tcMar>
-            <w:vAlign w:val="center"/>
-          </w:tcPr>
-          <w:p>
-            <w:pPr>
-              <w:spacing w:before="0" w:after="0" w:line="276" w:lineRule="auto"/>
-              <w:jc w:val="left"/>
-            </w:pPr>
-            <w:r>
-              <w:rPr>
-                <w:rFonts w:ascii="Aptos" w:hAnsi="Aptos"/>
-                <w:sz w:val="20"/>
-              </w:rPr>
-              <w:t>Trincas longitudinais longa (TLL) no pavimento na faixa de rolamento esquerda.</w:t>
-            </w:r>
-          </w:p>
-        </w:tc>
-        <w:tc>
-          <w:tcPr>
-            <w:tcW w:type="dxa" w:w="2261"/>
-            <w:tcMar>
-              <w:top w:w="100" w:type="dxa"/>
-              <w:bottom w:w="100" w:type="dxa"/>
-              <w:left w:w="150" w:type="dxa"/>
-              <w:right w:w="150" w:type="dxa"/>
-            </w:tcMar>
-            <w:vAlign w:val="center"/>
-          </w:tcPr>
-          <w:p>
-            <w:pPr>
-              <w:spacing w:before="0" w:after="0"/>
-              <w:jc w:val="center"/>
-            </w:pPr>
-            <w:r>
-              <w:rPr>
-                <w:rFonts w:ascii="Aptos" w:hAnsi="Aptos"/>
-                <w:b/>
-                <w:sz w:val="20"/>
-              </w:rPr>
-              <w:t>PENDENTE</w:t>
-            </w:r>
-          </w:p>
-        </w:tc>
-      </w:tr>
-      <w:tr>
-        <w:tc>
-          <w:tcPr>
-            <w:tcW w:type="dxa" w:w="2592"/>
-            <w:tcMar>
-              <w:top w:w="100" w:type="dxa"/>
-              <w:bottom w:w="100" w:type="dxa"/>
-              <w:left w:w="150" w:type="dxa"/>
-              <w:right w:w="150" w:type="dxa"/>
-            </w:tcMar>
-            <w:vAlign w:val="center"/>
-          </w:tcPr>
-          <w:p>
-            <w:pPr>
-              <w:spacing w:before="0" w:after="0" w:line="276" w:lineRule="auto"/>
-              <w:jc w:val="left"/>
-            </w:pPr>
-            <w:r>
-              <w:rPr>
-                <w:rFonts w:ascii="Aptos" w:hAnsi="Aptos"/>
-                <w:sz w:val="20"/>
-              </w:rPr>
-              <w:t>CRA.ST405.3970+3974/2025.017</w:t>
-            </w:r>
-          </w:p>
-        </w:tc>
-        <w:tc>
-          <w:tcPr>
-            <w:tcW w:type="dxa" w:w="6048"/>
-            <w:tcMar>
-              <w:top w:w="100" w:type="dxa"/>
-              <w:bottom w:w="100" w:type="dxa"/>
-              <w:left w:w="150" w:type="dxa"/>
-              <w:right w:w="150" w:type="dxa"/>
-            </w:tcMar>
-            <w:vAlign w:val="center"/>
-          </w:tcPr>
-          <w:p>
-            <w:pPr>
-              <w:spacing w:before="0" w:after="0" w:line="276" w:lineRule="auto"/>
-              <w:jc w:val="left"/>
-            </w:pPr>
-            <w:r>
-              <w:rPr>
-                <w:rFonts w:ascii="Aptos" w:hAnsi="Aptos"/>
-                <w:sz w:val="20"/>
-              </w:rPr>
-              <w:t>Trincas interligadas (J) e afundamento de trilha de rodas (ATC) no pavimento da faixa de rolamento direita.</w:t>
-            </w:r>
-          </w:p>
-        </w:tc>
-        <w:tc>
-          <w:tcPr>
-            <w:tcW w:type="dxa" w:w="2261"/>
-            <w:tcMar>
-              <w:top w:w="100" w:type="dxa"/>
-              <w:bottom w:w="100" w:type="dxa"/>
-              <w:left w:w="150" w:type="dxa"/>
-              <w:right w:w="150" w:type="dxa"/>
-            </w:tcMar>
-            <w:vAlign w:val="center"/>
-          </w:tcPr>
-          <w:p>
-            <w:pPr>
-              <w:spacing w:before="0" w:after="0"/>
-              <w:jc w:val="center"/>
-            </w:pPr>
-            <w:r>
-              <w:rPr>
-                <w:rFonts w:ascii="Aptos" w:hAnsi="Aptos"/>
-                <w:b/>
-                <w:sz w:val="20"/>
-              </w:rPr>
-              <w:t>PENDENTE</w:t>
-            </w:r>
-          </w:p>
-        </w:tc>
-      </w:tr>
-      <w:tr>
-        <w:tc>
-          <w:tcPr>
-            <w:tcW w:type="dxa" w:w="2592"/>
-            <w:tcMar>
-              <w:top w:w="100" w:type="dxa"/>
-              <w:bottom w:w="100" w:type="dxa"/>
-              <w:left w:w="150" w:type="dxa"/>
-              <w:right w:w="150" w:type="dxa"/>
-            </w:tcMar>
-            <w:vAlign w:val="center"/>
-          </w:tcPr>
-          <w:p>
-            <w:pPr>
-              <w:spacing w:before="0" w:after="0" w:line="276" w:lineRule="auto"/>
-              <w:jc w:val="left"/>
-            </w:pPr>
-            <w:r>
-              <w:rPr>
-                <w:rFonts w:ascii="Aptos" w:hAnsi="Aptos"/>
-                <w:sz w:val="20"/>
-              </w:rPr>
-              <w:t>CRA.ST405.4034-4040/2025.018</w:t>
-            </w:r>
-          </w:p>
-        </w:tc>
-        <w:tc>
-          <w:tcPr>
-            <w:tcW w:type="dxa" w:w="6048"/>
-            <w:tcMar>
-              <w:top w:w="100" w:type="dxa"/>
-              <w:bottom w:w="100" w:type="dxa"/>
-              <w:left w:w="150" w:type="dxa"/>
-              <w:right w:w="150" w:type="dxa"/>
-            </w:tcMar>
-            <w:vAlign w:val="center"/>
-          </w:tcPr>
-          <w:p>
-            <w:pPr>
-              <w:spacing w:before="0" w:after="0" w:line="276" w:lineRule="auto"/>
-              <w:jc w:val="left"/>
-            </w:pPr>
-            <w:r>
-              <w:rPr>
-                <w:rFonts w:ascii="Aptos" w:hAnsi="Aptos"/>
-                <w:sz w:val="20"/>
-              </w:rPr>
-              <w:t>Afundamento de trilha de rodas (ATC) e afundamento de consolidação no pavimento da faixa de rolamento direita.</w:t>
-            </w:r>
-          </w:p>
-        </w:tc>
-        <w:tc>
-          <w:tcPr>
-            <w:tcW w:type="dxa" w:w="2261"/>
-            <w:tcMar>
-              <w:top w:w="100" w:type="dxa"/>
-              <w:bottom w:w="100" w:type="dxa"/>
-              <w:left w:w="150" w:type="dxa"/>
-              <w:right w:w="150" w:type="dxa"/>
-            </w:tcMar>
-            <w:vAlign w:val="center"/>
-          </w:tcPr>
-          <w:p>
-            <w:pPr>
-              <w:spacing w:before="0" w:after="0"/>
-              <w:jc w:val="center"/>
-            </w:pPr>
-            <w:r>
-              <w:rPr>
-                <w:rFonts w:ascii="Aptos" w:hAnsi="Aptos"/>
-                <w:b/>
-                <w:sz w:val="20"/>
-              </w:rPr>
-              <w:t>PENDENTE</w:t>
-            </w:r>
-          </w:p>
-        </w:tc>
-      </w:tr>
-      <w:tr>
-        <w:tc>
-          <w:tcPr>
-            <w:tcW w:type="dxa" w:w="2592"/>
-            <w:tcMar>
-              <w:top w:w="100" w:type="dxa"/>
-              <w:bottom w:w="100" w:type="dxa"/>
-              <w:left w:w="150" w:type="dxa"/>
-              <w:right w:w="150" w:type="dxa"/>
-            </w:tcMar>
-            <w:vAlign w:val="center"/>
-          </w:tcPr>
-          <w:p>
-            <w:pPr>
-              <w:spacing w:before="0" w:after="0" w:line="276" w:lineRule="auto"/>
-              <w:jc w:val="left"/>
-            </w:pPr>
-            <w:r>
-              <w:rPr>
-                <w:rFonts w:ascii="Aptos" w:hAnsi="Aptos"/>
-                <w:sz w:val="20"/>
-              </w:rPr>
-              <w:t>CRA.ST106.4956-4948/2025.019</w:t>
-            </w:r>
-          </w:p>
-        </w:tc>
-        <w:tc>
-          <w:tcPr>
-            <w:tcW w:type="dxa" w:w="6048"/>
-            <w:tcMar>
-              <w:top w:w="100" w:type="dxa"/>
-              <w:bottom w:w="100" w:type="dxa"/>
-              <w:left w:w="150" w:type="dxa"/>
-              <w:right w:w="150" w:type="dxa"/>
-            </w:tcMar>
-            <w:vAlign w:val="center"/>
-          </w:tcPr>
-          <w:p>
-            <w:pPr>
-              <w:spacing w:before="0" w:after="0" w:line="276" w:lineRule="auto"/>
-              <w:jc w:val="left"/>
-            </w:pPr>
-            <w:r>
-              <w:rPr>
-                <w:rFonts w:ascii="Aptos" w:hAnsi="Aptos"/>
-                <w:sz w:val="20"/>
-              </w:rPr>
-              <w:t>Afundamento de trilha de rodas (ATC) e afundamento com solevamento, e grande Erosão no pavimento da faixa de rolamento direita</w:t>
-            </w:r>
-          </w:p>
-        </w:tc>
-        <w:tc>
-          <w:tcPr>
-            <w:tcW w:type="dxa" w:w="2261"/>
-            <w:tcMar>
-              <w:top w:w="100" w:type="dxa"/>
-              <w:bottom w:w="100" w:type="dxa"/>
-              <w:left w:w="150" w:type="dxa"/>
-              <w:right w:w="150" w:type="dxa"/>
-            </w:tcMar>
-            <w:vAlign w:val="center"/>
-          </w:tcPr>
-          <w:p>
-            <w:pPr>
-              <w:spacing w:before="0" w:after="0"/>
-              <w:jc w:val="center"/>
-            </w:pPr>
-            <w:r>
-              <w:rPr>
-                <w:rFonts w:ascii="Aptos" w:hAnsi="Aptos"/>
-                <w:b/>
-                <w:sz w:val="20"/>
-              </w:rPr>
-              <w:t>PENDENTE</w:t>
-            </w:r>
-          </w:p>
-        </w:tc>
-      </w:tr>
-      <w:tr>
-        <w:tc>
-          <w:tcPr>
-            <w:tcW w:type="dxa" w:w="2592"/>
-            <w:tcMar>
-              <w:top w:w="100" w:type="dxa"/>
-              <w:bottom w:w="100" w:type="dxa"/>
-              <w:left w:w="150" w:type="dxa"/>
-              <w:right w:w="150" w:type="dxa"/>
-            </w:tcMar>
-            <w:vAlign w:val="center"/>
-          </w:tcPr>
-          <w:p>
-            <w:pPr>
-              <w:spacing w:before="0" w:after="0" w:line="276" w:lineRule="auto"/>
-              <w:jc w:val="left"/>
-            </w:pPr>
-            <w:r>
-              <w:rPr>
-                <w:rFonts w:ascii="Aptos" w:hAnsi="Aptos"/>
-                <w:sz w:val="20"/>
-              </w:rPr>
-              <w:t>CRA.ST406.4024-4010/2025.020</w:t>
-            </w:r>
-          </w:p>
-        </w:tc>
-        <w:tc>
-          <w:tcPr>
-            <w:tcW w:type="dxa" w:w="6048"/>
-            <w:tcMar>
-              <w:top w:w="100" w:type="dxa"/>
-              <w:bottom w:w="100" w:type="dxa"/>
-              <w:left w:w="150" w:type="dxa"/>
-              <w:right w:w="150" w:type="dxa"/>
-            </w:tcMar>
-            <w:vAlign w:val="center"/>
-          </w:tcPr>
-          <w:p>
-            <w:pPr>
-              <w:spacing w:before="0" w:after="0" w:line="276" w:lineRule="auto"/>
-              <w:jc w:val="left"/>
-            </w:pPr>
-            <w:r>
-              <w:rPr>
-                <w:rFonts w:ascii="Aptos" w:hAnsi="Aptos"/>
-                <w:sz w:val="20"/>
-              </w:rPr>
-              <w:t>Afundamento de trilha de rodas (ATC) e Trincas Interligadas (j) no pavimento da faixa de rolamento direita</w:t>
-            </w:r>
-          </w:p>
-        </w:tc>
-        <w:tc>
-          <w:tcPr>
-            <w:tcW w:type="dxa" w:w="2261"/>
-            <w:tcMar>
-              <w:top w:w="100" w:type="dxa"/>
-              <w:bottom w:w="100" w:type="dxa"/>
-              <w:left w:w="150" w:type="dxa"/>
-              <w:right w:w="150" w:type="dxa"/>
-            </w:tcMar>
-            <w:vAlign w:val="center"/>
-          </w:tcPr>
-          <w:p>
-            <w:pPr>
-              <w:spacing w:before="0" w:after="0"/>
-              <w:jc w:val="center"/>
-            </w:pPr>
-            <w:r>
-              <w:rPr>
-                <w:rFonts w:ascii="Aptos" w:hAnsi="Aptos"/>
-                <w:b/>
-                <w:sz w:val="20"/>
-              </w:rPr>
-              <w:t>PENDENTE</w:t>
-            </w:r>
-          </w:p>
-        </w:tc>
-      </w:tr>
-      <w:tr>
-        <w:tc>
-          <w:tcPr>
-            <w:tcW w:type="dxa" w:w="2592"/>
-            <w:tcMar>
-              <w:top w:w="100" w:type="dxa"/>
-              <w:bottom w:w="100" w:type="dxa"/>
-              <w:left w:w="150" w:type="dxa"/>
-              <w:right w:w="150" w:type="dxa"/>
-            </w:tcMar>
-            <w:vAlign w:val="center"/>
-          </w:tcPr>
-          <w:p>
-            <w:pPr>
-              <w:spacing w:before="0" w:after="0" w:line="276" w:lineRule="auto"/>
-              <w:jc w:val="left"/>
-            </w:pPr>
-            <w:r>
-              <w:rPr>
-                <w:rFonts w:ascii="Aptos" w:hAnsi="Aptos"/>
-                <w:sz w:val="20"/>
-              </w:rPr>
-              <w:t>CRA.ST410.3598-3590/2025.021</w:t>
-            </w:r>
-          </w:p>
-        </w:tc>
-        <w:tc>
-          <w:tcPr>
-            <w:tcW w:type="dxa" w:w="6048"/>
-            <w:tcMar>
-              <w:top w:w="100" w:type="dxa"/>
-              <w:bottom w:w="100" w:type="dxa"/>
-              <w:left w:w="150" w:type="dxa"/>
-              <w:right w:w="150" w:type="dxa"/>
-            </w:tcMar>
-            <w:vAlign w:val="center"/>
-          </w:tcPr>
-          <w:p>
-            <w:pPr>
-              <w:spacing w:before="0" w:after="0" w:line="276" w:lineRule="auto"/>
-              <w:jc w:val="left"/>
-            </w:pPr>
-            <w:r>
-              <w:rPr>
-                <w:rFonts w:ascii="Aptos" w:hAnsi="Aptos"/>
-                <w:sz w:val="20"/>
-              </w:rPr>
-              <w:t>Afundamento de trilha de rodas (ATC), afundamento e remendos no pavimento da faixa de rolamento direita.</w:t>
-            </w:r>
-          </w:p>
-        </w:tc>
-        <w:tc>
-          <w:tcPr>
-            <w:tcW w:type="dxa" w:w="2261"/>
-            <w:tcMar>
-              <w:top w:w="100" w:type="dxa"/>
-              <w:bottom w:w="100" w:type="dxa"/>
-              <w:left w:w="150" w:type="dxa"/>
-              <w:right w:w="150" w:type="dxa"/>
-            </w:tcMar>
-            <w:vAlign w:val="center"/>
-          </w:tcPr>
-          <w:p>
-            <w:pPr>
-              <w:spacing w:before="0" w:after="0"/>
-              <w:jc w:val="center"/>
-            </w:pPr>
-            <w:r>
-              <w:rPr>
-                <w:rFonts w:ascii="Aptos" w:hAnsi="Aptos"/>
-                <w:b/>
-                <w:sz w:val="20"/>
-              </w:rPr>
-              <w:t>PENDENTE</w:t>
-            </w:r>
-          </w:p>
-        </w:tc>
-      </w:tr>
-      <w:tr>
-        <w:tc>
-          <w:tcPr>
-            <w:tcW w:type="dxa" w:w="2592"/>
-            <w:tcMar>
-              <w:top w:w="100" w:type="dxa"/>
-              <w:bottom w:w="100" w:type="dxa"/>
-              <w:left w:w="150" w:type="dxa"/>
-              <w:right w:w="150" w:type="dxa"/>
-            </w:tcMar>
-            <w:vAlign w:val="center"/>
-          </w:tcPr>
-          <w:p>
-            <w:pPr>
-              <w:spacing w:before="0" w:after="0" w:line="276" w:lineRule="auto"/>
-              <w:jc w:val="left"/>
-            </w:pPr>
-            <w:r>
-              <w:rPr>
-                <w:rFonts w:ascii="Aptos" w:hAnsi="Aptos"/>
-                <w:sz w:val="20"/>
-              </w:rPr>
-              <w:t>CRA.ST610.3340-3330/2025.022</w:t>
-            </w:r>
-          </w:p>
-        </w:tc>
-        <w:tc>
-          <w:tcPr>
-            <w:tcW w:type="dxa" w:w="6048"/>
-            <w:tcMar>
-              <w:top w:w="100" w:type="dxa"/>
-              <w:bottom w:w="100" w:type="dxa"/>
-              <w:left w:w="150" w:type="dxa"/>
-              <w:right w:w="150" w:type="dxa"/>
-            </w:tcMar>
-            <w:vAlign w:val="center"/>
-          </w:tcPr>
-          <w:p>
-            <w:pPr>
-              <w:spacing w:before="0" w:after="0" w:line="276" w:lineRule="auto"/>
-              <w:jc w:val="left"/>
-            </w:pPr>
-            <w:r>
-              <w:rPr>
-                <w:rFonts w:ascii="Aptos" w:hAnsi="Aptos"/>
-                <w:sz w:val="20"/>
-              </w:rPr>
-              <w:t>Trincas longitudinais (TLL) e trincas “Jacaré” com erosão acentuada nas bordas (JE), no pavimento da faixa de rolamento esquerda; e Afundamento de trilha de rodas (ATC) na faixa direita.</w:t>
-            </w:r>
-          </w:p>
-        </w:tc>
-        <w:tc>
-          <w:tcPr>
-            <w:tcW w:type="dxa" w:w="2261"/>
-            <w:tcMar>
-              <w:top w:w="100" w:type="dxa"/>
-              <w:bottom w:w="100" w:type="dxa"/>
-              <w:left w:w="150" w:type="dxa"/>
-              <w:right w:w="150" w:type="dxa"/>
-            </w:tcMar>
-            <w:vAlign w:val="center"/>
-          </w:tcPr>
-          <w:p>
-            <w:pPr>
-              <w:spacing w:before="0" w:after="0"/>
-              <w:jc w:val="center"/>
-            </w:pPr>
-            <w:r>
-              <w:rPr>
-                <w:rFonts w:ascii="Aptos" w:hAnsi="Aptos"/>
-                <w:b/>
-                <w:sz w:val="20"/>
-              </w:rPr>
-              <w:t>PENDENTE</w:t>
-            </w:r>
-          </w:p>
-        </w:tc>
-      </w:tr>
-      <w:tr>
-        <w:tc>
-          <w:tcPr>
-            <w:tcW w:type="dxa" w:w="2592"/>
-            <w:tcMar>
-              <w:top w:w="100" w:type="dxa"/>
-              <w:bottom w:w="100" w:type="dxa"/>
-              <w:left w:w="150" w:type="dxa"/>
-              <w:right w:w="150" w:type="dxa"/>
-            </w:tcMar>
-            <w:vAlign w:val="center"/>
-          </w:tcPr>
-          <w:p>
-            <w:pPr>
-              <w:spacing w:before="0" w:after="0" w:line="276" w:lineRule="auto"/>
-              <w:jc w:val="left"/>
-            </w:pPr>
-            <w:r>
-              <w:rPr>
-                <w:rFonts w:ascii="Aptos" w:hAnsi="Aptos"/>
-                <w:sz w:val="20"/>
-              </w:rPr>
-              <w:t>CRA.ST611.3245-3220/2025.023</w:t>
-            </w:r>
-          </w:p>
-        </w:tc>
-        <w:tc>
-          <w:tcPr>
-            <w:tcW w:type="dxa" w:w="6048"/>
-            <w:tcMar>
-              <w:top w:w="100" w:type="dxa"/>
-              <w:bottom w:w="100" w:type="dxa"/>
-              <w:left w:w="150" w:type="dxa"/>
-              <w:right w:w="150" w:type="dxa"/>
-            </w:tcMar>
-            <w:vAlign w:val="center"/>
-          </w:tcPr>
-          <w:p>
-            <w:pPr>
-              <w:spacing w:before="0" w:after="0" w:line="276" w:lineRule="auto"/>
-              <w:jc w:val="left"/>
-            </w:pPr>
-            <w:r>
-              <w:rPr>
-                <w:rFonts w:ascii="Aptos" w:hAnsi="Aptos"/>
-                <w:sz w:val="20"/>
-              </w:rPr>
-              <w:t>Afundamento de trilha de rodas (ACT), abatimentos e trincas interligadas no pavimento da faixa de rolamento direita; e trincas longitudinais (TLL) no pavimento da faixa de rolamento esquerda.</w:t>
-            </w:r>
-          </w:p>
-        </w:tc>
-        <w:tc>
-          <w:tcPr>
-            <w:tcW w:type="dxa" w:w="2261"/>
-            <w:tcMar>
-              <w:top w:w="100" w:type="dxa"/>
-              <w:bottom w:w="100" w:type="dxa"/>
-              <w:left w:w="150" w:type="dxa"/>
-              <w:right w:w="150" w:type="dxa"/>
-            </w:tcMar>
-            <w:vAlign w:val="center"/>
-          </w:tcPr>
-          <w:p>
-            <w:pPr>
-              <w:spacing w:before="0" w:after="0"/>
-              <w:jc w:val="center"/>
-            </w:pPr>
-            <w:r>
-              <w:rPr>
-                <w:rFonts w:ascii="Aptos" w:hAnsi="Aptos"/>
-                <w:b/>
-                <w:sz w:val="20"/>
-              </w:rPr>
-              <w:t>PENDENTE</w:t>
-            </w:r>
-          </w:p>
-        </w:tc>
-      </w:tr>
-      <w:tr>
-        <w:tc>
-          <w:tcPr>
-            <w:tcW w:type="dxa" w:w="2592"/>
-            <w:tcMar>
-              <w:top w:w="100" w:type="dxa"/>
-              <w:bottom w:w="100" w:type="dxa"/>
-              <w:left w:w="150" w:type="dxa"/>
-              <w:right w:w="150" w:type="dxa"/>
-            </w:tcMar>
-            <w:vAlign w:val="center"/>
-          </w:tcPr>
-          <w:p>
-            <w:pPr>
-              <w:spacing w:before="0" w:after="0" w:line="276" w:lineRule="auto"/>
-              <w:jc w:val="left"/>
-            </w:pPr>
-            <w:r>
-              <w:rPr>
-                <w:rFonts w:ascii="Aptos" w:hAnsi="Aptos"/>
-                <w:sz w:val="20"/>
-              </w:rPr>
-              <w:t>CRA.ST612.3089-3082/2025.024</w:t>
-            </w:r>
-          </w:p>
-        </w:tc>
-        <w:tc>
-          <w:tcPr>
-            <w:tcW w:type="dxa" w:w="6048"/>
-            <w:tcMar>
-              <w:top w:w="100" w:type="dxa"/>
-              <w:bottom w:w="100" w:type="dxa"/>
-              <w:left w:w="150" w:type="dxa"/>
-              <w:right w:w="150" w:type="dxa"/>
-            </w:tcMar>
-            <w:vAlign w:val="center"/>
-          </w:tcPr>
-          <w:p>
-            <w:pPr>
-              <w:spacing w:before="0" w:after="0" w:line="276" w:lineRule="auto"/>
-              <w:jc w:val="left"/>
-            </w:pPr>
-            <w:r>
-              <w:rPr>
-                <w:rFonts w:ascii="Aptos" w:hAnsi="Aptos"/>
-                <w:sz w:val="20"/>
-              </w:rPr>
-              <w:t>Afundamento de trilha de rodas (ATC) e trincas interligadas tipo bloco com erosão acentuada nas bordas (TBE) no pavimento da faixa de rolamento direita.</w:t>
-            </w:r>
-          </w:p>
-        </w:tc>
-        <w:tc>
-          <w:tcPr>
-            <w:tcW w:type="dxa" w:w="2261"/>
-            <w:tcMar>
-              <w:top w:w="100" w:type="dxa"/>
-              <w:bottom w:w="100" w:type="dxa"/>
-              <w:left w:w="150" w:type="dxa"/>
-              <w:right w:w="150" w:type="dxa"/>
-            </w:tcMar>
-            <w:vAlign w:val="center"/>
-          </w:tcPr>
-          <w:p>
-            <w:pPr>
-              <w:spacing w:before="0" w:after="0"/>
-              <w:jc w:val="center"/>
-            </w:pPr>
-            <w:r>
-              <w:rPr>
-                <w:rFonts w:ascii="Aptos" w:hAnsi="Aptos"/>
-                <w:b/>
-                <w:sz w:val="20"/>
-              </w:rPr>
-              <w:t>PENDENTE</w:t>
-            </w:r>
-          </w:p>
-        </w:tc>
-      </w:tr>
-      <w:tr>
-        <w:tc>
-          <w:tcPr>
-            <w:tcW w:type="dxa" w:w="2592"/>
-            <w:tcMar>
-              <w:top w:w="100" w:type="dxa"/>
-              <w:bottom w:w="100" w:type="dxa"/>
-              <w:left w:w="150" w:type="dxa"/>
-              <w:right w:w="150" w:type="dxa"/>
-            </w:tcMar>
-            <w:vAlign w:val="center"/>
-          </w:tcPr>
-          <w:p>
-            <w:pPr>
-              <w:spacing w:before="0" w:after="0" w:line="276" w:lineRule="auto"/>
-              <w:jc w:val="left"/>
-            </w:pPr>
-            <w:r>
-              <w:rPr>
-                <w:rFonts w:ascii="Aptos" w:hAnsi="Aptos"/>
-                <w:sz w:val="20"/>
-              </w:rPr>
-              <w:t>CRA.ST608.3520-3480/2025.025</w:t>
-            </w:r>
-          </w:p>
-        </w:tc>
-        <w:tc>
-          <w:tcPr>
-            <w:tcW w:type="dxa" w:w="6048"/>
-            <w:tcMar>
-              <w:top w:w="100" w:type="dxa"/>
-              <w:bottom w:w="100" w:type="dxa"/>
-              <w:left w:w="150" w:type="dxa"/>
-              <w:right w:w="150" w:type="dxa"/>
-            </w:tcMar>
-            <w:vAlign w:val="center"/>
-          </w:tcPr>
-          <w:p>
-            <w:pPr>
-              <w:spacing w:before="0" w:after="0" w:line="276" w:lineRule="auto"/>
-              <w:jc w:val="left"/>
-            </w:pPr>
-            <w:r>
-              <w:rPr>
-                <w:rFonts w:ascii="Aptos" w:hAnsi="Aptos"/>
-                <w:sz w:val="20"/>
-              </w:rPr>
-              <w:t>Novas tachas refletivas colocadas no trecho sem a retirada das tachas refletivas anteriores, em especial as quebradas, e pinos aparentes apresentando riscos de acidentes.</w:t>
-            </w:r>
-          </w:p>
-        </w:tc>
-        <w:tc>
-          <w:tcPr>
-            <w:tcW w:type="dxa" w:w="2261"/>
-            <w:tcMar>
-              <w:top w:w="100" w:type="dxa"/>
-              <w:bottom w:w="100" w:type="dxa"/>
-              <w:left w:w="150" w:type="dxa"/>
-              <w:right w:w="150" w:type="dxa"/>
-            </w:tcMar>
-            <w:vAlign w:val="center"/>
-          </w:tcPr>
-          <w:p>
-            <w:pPr>
-              <w:spacing w:before="0" w:after="0"/>
-              <w:jc w:val="center"/>
-            </w:pPr>
-            <w:r>
-              <w:rPr>
-                <w:rFonts w:ascii="Aptos" w:hAnsi="Aptos"/>
-                <w:b/>
-                <w:sz w:val="20"/>
-              </w:rPr>
-              <w:t>PENDENTE</w:t>
-            </w:r>
-          </w:p>
-        </w:tc>
-      </w:tr>
-      <w:tr>
-        <w:tc>
-          <w:tcPr>
-            <w:tcW w:type="dxa" w:w="2592"/>
-            <w:tcMar>
-              <w:top w:w="100" w:type="dxa"/>
-              <w:bottom w:w="100" w:type="dxa"/>
-              <w:left w:w="150" w:type="dxa"/>
-              <w:right w:w="150" w:type="dxa"/>
-            </w:tcMar>
-            <w:vAlign w:val="center"/>
-          </w:tcPr>
-          <w:p>
-            <w:pPr>
-              <w:spacing w:before="0" w:after="0" w:line="276" w:lineRule="auto"/>
-              <w:jc w:val="left"/>
-            </w:pPr>
-            <w:r>
-              <w:rPr>
-                <w:rFonts w:ascii="Aptos" w:hAnsi="Aptos"/>
-                <w:sz w:val="20"/>
-              </w:rPr>
-              <w:t>CRA.ST202.0370-0270/2025.026</w:t>
-            </w:r>
-          </w:p>
-        </w:tc>
-        <w:tc>
-          <w:tcPr>
-            <w:tcW w:type="dxa" w:w="6048"/>
-            <w:tcMar>
-              <w:top w:w="100" w:type="dxa"/>
-              <w:bottom w:w="100" w:type="dxa"/>
-              <w:left w:w="150" w:type="dxa"/>
-              <w:right w:w="150" w:type="dxa"/>
-            </w:tcMar>
-            <w:vAlign w:val="center"/>
-          </w:tcPr>
-          <w:p>
-            <w:pPr>
-              <w:spacing w:before="0" w:after="0" w:line="276" w:lineRule="auto"/>
-              <w:jc w:val="left"/>
-            </w:pPr>
-            <w:r>
-              <w:rPr>
-                <w:rFonts w:ascii="Aptos" w:hAnsi="Aptos"/>
-                <w:sz w:val="20"/>
-              </w:rPr>
-              <w:t>Novas tachas refletivas colocadas no trecho sem a retirada das tachas refletivas anteriores, em especial as quebradas, e pinos aparentes apresentando riscos de acidentes.</w:t>
-            </w:r>
-          </w:p>
-        </w:tc>
-        <w:tc>
-          <w:tcPr>
-            <w:tcW w:type="dxa" w:w="2261"/>
-            <w:tcMar>
-              <w:top w:w="100" w:type="dxa"/>
-              <w:bottom w:w="100" w:type="dxa"/>
-              <w:left w:w="150" w:type="dxa"/>
-              <w:right w:w="150" w:type="dxa"/>
-            </w:tcMar>
-            <w:vAlign w:val="center"/>
-          </w:tcPr>
-          <w:p>
-            <w:pPr>
-              <w:spacing w:before="0" w:after="0"/>
-              <w:jc w:val="center"/>
-            </w:pPr>
-            <w:r>
-              <w:rPr>
-                <w:rFonts w:ascii="Aptos" w:hAnsi="Aptos"/>
-                <w:b/>
-                <w:sz w:val="20"/>
-              </w:rPr>
-              <w:t>PENDENTE</w:t>
+              <w:t>Pendente</w:t>
             </w:r>
           </w:p>
         </w:tc>
       </w:tr>
     </w:tbl>
     <w:p/>
+    <w:p>
+      <w:pPr>
+        <w:spacing w:before="80" w:after="120" w:line="276" w:lineRule="auto"/>
+        <w:jc w:val="both"/>
+      </w:pPr>
+      <w:r>
+        <w:rPr>
+          <w:rFonts w:ascii="Aptos" w:hAnsi="Aptos"/>
+          <w:i/>
+          <w:sz w:val="20"/>
+        </w:rPr>
+        <w:t>(*) ID. NC: Identificação da Não Conformidade, composta com o Segmento Homogêneo (SH) e a quilometragem do ponto fiscalizado (KM).</w:t>
+      </w:r>
+    </w:p>
     <w:p/>
     <w:p>
       <w:pPr>
@@ -2274,7 +1034,7 @@
           <w:rFonts w:ascii="Aptos" w:hAnsi="Aptos"/>
           <w:sz w:val="22"/>
         </w:rPr>
-        <w:t>O resultado das vistorias realizadas nos dias 15 de abril de 2026 e das respectivas análises apresentadas neste 2º Relatório de Monitoramento demonstram a evolução do tratamento das Não Conformidades identificadas no Relatório de Fiscalização Técnico-Operacional ARPE/CTR 07/2025. Recomenda-se que a Concessionária mantenha atualizado o cronograma das obras e soluções pendentes visando permitir à ARPE uma programação efetiva do monitoramento.</w:t>
+        <w:t>As vistorias técnicas, realizadas em 15 de junho de 2026, bem como das análises apresentadas neste Xº Relatório de Monitoramento do Relatório de Fiscalização Técnico-Operacional ARPE/CTR nº XX/XXXX, indicam que permanece uma Não Conformidade ainda sem solução definitiva.</w:t>
       </w:r>
     </w:p>
     <w:p>
@@ -2287,7 +1047,20 @@
           <w:rFonts w:ascii="Aptos" w:hAnsi="Aptos"/>
           <w:sz w:val="22"/>
         </w:rPr>
-        <w:t>Por fim, solicita-se dar conhecimento deste 2º Relatório de Monitoramento do Relatório de Fiscalização Técnico-Operacional ARPE/CTR 07/2025 à Diretoria de Desenvolvimento e Gestão Portuária de SUAPE para as devidas providências, em atendimento ao Convênio ARPE/Suape nº 003/2021.</w:t>
+        <w:t>Recomenda-se que a Concessionária mantenha a ARPE informada sobre as interações com a Associação Geral da Reserva do Paiva para evitar definitivamente a presença de detritos no trecho concedido.</w:t>
+      </w:r>
+    </w:p>
+    <w:p>
+      <w:pPr>
+        <w:spacing w:after="120" w:line="276" w:lineRule="auto"/>
+        <w:jc w:val="both"/>
+      </w:pPr>
+      <w:r>
+        <w:rPr>
+          <w:rFonts w:ascii="Aptos" w:hAnsi="Aptos"/>
+          <w:sz w:val="22"/>
+        </w:rPr>
+        <w:t>Diante desse resultado, considera-se necessário que a ARPE continue realizando vistorias até que a Concessionária efetive a execução dos serviços para correção da Não Conformidade identificada.</w:t>
       </w:r>
     </w:p>
     <w:p/>
@@ -2316,7 +1089,7 @@
           <w:b/>
           <w:sz w:val="22"/>
         </w:rPr>
-        <w:t>Cícero Ronaldo</w:t>
+        <w:t>Alcides Vieira de Azevedo Bezerra</w:t>
       </w:r>
     </w:p>
     <w:p>
@@ -2342,7 +1115,7 @@
           <w:rFonts w:ascii="Aptos" w:hAnsi="Aptos"/>
           <w:sz w:val="22"/>
         </w:rPr>
-        <w:t>Matrícula nº xxxxxxx/xx</w:t>
+        <w:t>Matrícula nº 40672015/01</w:t>
       </w:r>
     </w:p>
     <w:p/>
@@ -2357,7 +1130,7 @@
           <w:b/>
           <w:sz w:val="22"/>
         </w:rPr>
-        <w:t>Enildo Manoel</w:t>
+        <w:t>Enildo Manoel da Silva Júnior</w:t>
       </w:r>
     </w:p>
     <w:p>
@@ -2383,7 +1156,7 @@
           <w:rFonts w:ascii="Aptos" w:hAnsi="Aptos"/>
           <w:sz w:val="22"/>
         </w:rPr>
-        <w:t>Matrícula nº xxxxxxx/xx</w:t>
+        <w:t>Matrícula nº 1796500/02</w:t>
       </w:r>
     </w:p>
     <w:p/>
@@ -2453,12 +1226,12 @@
           <w:color w:val="000000"/>
           <w:sz w:val="24"/>
         </w:rPr>
-        <w:t>APÊNDICE - MEMORIAL FOTOGRÁFICO - VISTORIAS REALIZADAS EM 15/04/2026</w:t>
+        <w:t>APÊNDÍCE ÚNCO - MEMORIAL FOTOGRÁFICO - JUNHO, 2026</w:t>
       </w:r>
     </w:p>
     <w:p>
       <w:pPr>
-        <w:spacing w:after="240"/>
+        <w:spacing w:before="120" w:after="240" w:line="276" w:lineRule="auto"/>
         <w:jc w:val="both"/>
       </w:pPr>
       <w:r>
@@ -2466,495 +1239,9 @@
           <w:rFonts w:ascii="Aptos" w:hAnsi="Aptos"/>
           <w:sz w:val="22"/>
         </w:rPr>
-        <w:t>Apresentam-se, a seguir, as evidências fotográficas coletadas no monitoramento das Não Conformidades apontadas no Relatório de Fiscalização Técnico-Operacional ARPE/CTR 07/2025.</w:t>
+        <w:t>Apresenta-se, a seguir, as evidências da situação das Não Conformidades, de acordo com o sentido da pista e as identificações utilizadas neste Xº Relatório de Monitoramento do Processo de Fiscalização Técnico-Operacional nº XX/XXXX (foto 01).</w:t>
       </w:r>
     </w:p>
-    <w:p>
-      <w:pPr>
-        <w:spacing w:before="240" w:after="120" w:line="276" w:lineRule="auto"/>
-        <w:jc w:val="both"/>
-      </w:pPr>
-      <w:r>
-        <w:rPr>
-          <w:rFonts w:ascii="Aptos" w:hAnsi="Aptos"/>
-          <w:b/>
-          <w:sz w:val="22"/>
-        </w:rPr>
-        <w:t>CRA.ST601.2794-2834/2025.013 - TRINCAS INTERLIGADAS – RODOVIA ESTADUAL PE - 009 – CRA.ST601.2794-2834/2025.013 - TRINCAS INTERLIGADAS</w:t>
-      </w:r>
-    </w:p>
-    <w:tbl>
-      <w:tblPr>
-        <w:tblStyle w:val="TableGrid"/>
-        <w:tblW w:type="auto" w:w="0"/>
-        <w:jc w:val="center"/>
-        <w:tblLayout w:type="fixed"/>
-        <w:tblLook w:firstColumn="1" w:firstRow="1" w:lastColumn="0" w:lastRow="0" w:noHBand="0" w:noVBand="1" w:val="04A0"/>
-      </w:tblPr>
-      <w:tblGrid>
-        <w:gridCol w:w="5234"/>
-        <w:gridCol w:w="5234"/>
-      </w:tblGrid>
-      <w:tr>
-        <w:tc>
-          <w:tcPr>
-            <w:tcW w:type="dxa" w:w="5234"/>
-          </w:tcPr>
-          <w:p>
-            <w:pPr>
-              <w:spacing w:before="80" w:after="80"/>
-              <w:ind w:left="0" w:firstLine="0"/>
-              <w:jc w:val="center"/>
-            </w:pPr>
-            <w:r>
-              <w:drawing>
-                <wp:inline xmlns:a="http://schemas.openxmlformats.org/drawingml/2006/main" xmlns:pic="http://schemas.openxmlformats.org/drawingml/2006/picture">
-                  <wp:extent cx="2476195" cy="2476195"/>
-                  <wp:docPr id="2" name="Picture 2"/>
-                  <wp:cNvGraphicFramePr>
-                    <a:graphicFrameLocks noChangeAspect="1"/>
-                  </wp:cNvGraphicFramePr>
-                  <a:graphic>
-                    <a:graphicData uri="http://schemas.openxmlformats.org/drawingml/2006/picture">
-                      <pic:pic>
-                        <pic:nvPicPr>
-                          <pic:cNvPr id="0" name="CRA.ST601.2794-2834_2025.013 - TRINCAS INTERLIGADAS_1.jpg"/>
-                          <pic:cNvPicPr/>
-                        </pic:nvPicPr>
-                        <pic:blipFill>
-                          <a:blip r:embed="rId10"/>
-                          <a:stretch>
-                            <a:fillRect/>
-                          </a:stretch>
-                        </pic:blipFill>
-                        <pic:spPr>
-                          <a:xfrm>
-                            <a:off x="0" y="0"/>
-                            <a:ext cx="2476195" cy="2476195"/>
-                          </a:xfrm>
-                          <a:prstGeom prst="rect"/>
-                        </pic:spPr>
-                      </pic:pic>
-                    </a:graphicData>
-                  </a:graphic>
-                </wp:inline>
-              </w:drawing>
-            </w:r>
-          </w:p>
-        </w:tc>
-        <w:tc>
-          <w:tcPr>
-            <w:tcW w:type="dxa" w:w="5234"/>
-          </w:tcPr>
-          <w:p>
-            <w:pPr>
-              <w:spacing w:before="80" w:after="80"/>
-              <w:ind w:left="0" w:firstLine="0"/>
-              <w:jc w:val="center"/>
-            </w:pPr>
-            <w:r>
-              <w:drawing>
-                <wp:inline xmlns:a="http://schemas.openxmlformats.org/drawingml/2006/main" xmlns:pic="http://schemas.openxmlformats.org/drawingml/2006/picture">
-                  <wp:extent cx="2476195" cy="2476195"/>
-                  <wp:docPr id="3" name="Picture 3"/>
-                  <wp:cNvGraphicFramePr>
-                    <a:graphicFrameLocks noChangeAspect="1"/>
-                  </wp:cNvGraphicFramePr>
-                  <a:graphic>
-                    <a:graphicData uri="http://schemas.openxmlformats.org/drawingml/2006/picture">
-                      <pic:pic>
-                        <pic:nvPicPr>
-                          <pic:cNvPr id="0" name="capa_monitoramento.png"/>
-                          <pic:cNvPicPr/>
-                        </pic:nvPicPr>
-                        <pic:blipFill>
-                          <a:blip r:embed="rId9"/>
-                          <a:stretch>
-                            <a:fillRect/>
-                          </a:stretch>
-                        </pic:blipFill>
-                        <pic:spPr>
-                          <a:xfrm>
-                            <a:off x="0" y="0"/>
-                            <a:ext cx="2476195" cy="2476195"/>
-                          </a:xfrm>
-                          <a:prstGeom prst="rect"/>
-                        </pic:spPr>
-                      </pic:pic>
-                    </a:graphicData>
-                  </a:graphic>
-                </wp:inline>
-              </w:drawing>
-            </w:r>
-          </w:p>
-        </w:tc>
-      </w:tr>
-      <w:tr>
-        <w:tc>
-          <w:tcPr>
-            <w:tcW w:type="dxa" w:w="5234"/>
-          </w:tcPr>
-          <w:p>
-            <w:pPr>
-              <w:spacing w:before="80" w:after="80"/>
-              <w:ind w:left="0" w:firstLine="0"/>
-              <w:jc w:val="both"/>
-            </w:pPr>
-            <w:r>
-              <w:rPr>
-                <w:rFonts w:ascii="Aptos" w:hAnsi="Aptos"/>
-                <w:sz w:val="20"/>
-              </w:rPr>
-              <w:t>Foto 02 – Pavimento Recuperado da faixa de rolamento direita no trecho do km 27.920 ao Km 28.120.</w:t>
-            </w:r>
-          </w:p>
-        </w:tc>
-        <w:tc>
-          <w:tcPr>
-            <w:tcW w:type="dxa" w:w="5234"/>
-          </w:tcPr>
-          <w:p>
-            <w:pPr>
-              <w:spacing w:before="80" w:after="80"/>
-              <w:ind w:left="0" w:firstLine="0"/>
-              <w:jc w:val="both"/>
-            </w:pPr>
-            <w:r>
-              <w:rPr>
-                <w:rFonts w:ascii="Aptos" w:hAnsi="Aptos"/>
-                <w:sz w:val="20"/>
-              </w:rPr>
-              <w:t>Foto 02 – Trincas interligadas (J) com erosão acentuada nas bordas das trincas (JE) e afundamento de trilha de rodas (ACT) no pavimento da faixa de rolamento direita.</w:t>
-            </w:r>
-          </w:p>
-        </w:tc>
-      </w:tr>
-    </w:tbl>
-    <w:p/>
-    <w:p>
-      <w:pPr>
-        <w:spacing w:before="240" w:after="120" w:line="276" w:lineRule="auto"/>
-        <w:jc w:val="both"/>
-      </w:pPr>
-      <w:r>
-        <w:rPr>
-          <w:rFonts w:ascii="Aptos" w:hAnsi="Aptos"/>
-          <w:b/>
-          <w:sz w:val="22"/>
-        </w:rPr>
-        <w:t>CRA.ST605.3212-3230/2025.014 – RODOVIA ESTADUAL PE - 009 – CRA.ST605.3212-3230/2025.014</w:t>
-      </w:r>
-    </w:p>
-    <w:tbl>
-      <w:tblPr>
-        <w:tblStyle w:val="TableGrid"/>
-        <w:tblW w:type="auto" w:w="0"/>
-        <w:jc w:val="center"/>
-        <w:tblLayout w:type="fixed"/>
-        <w:tblLook w:firstColumn="1" w:firstRow="1" w:lastColumn="0" w:lastRow="0" w:noHBand="0" w:noVBand="1" w:val="04A0"/>
-      </w:tblPr>
-      <w:tblGrid>
-        <w:gridCol w:w="5234"/>
-        <w:gridCol w:w="5234"/>
-      </w:tblGrid>
-      <w:tr>
-        <w:tc>
-          <w:tcPr>
-            <w:tcW w:type="dxa" w:w="5234"/>
-          </w:tcPr>
-          <w:p>
-            <w:pPr>
-              <w:spacing w:before="80" w:after="80"/>
-              <w:ind w:left="0" w:firstLine="0"/>
-              <w:jc w:val="center"/>
-            </w:pPr>
-            <w:r>
-              <w:drawing>
-                <wp:inline xmlns:a="http://schemas.openxmlformats.org/drawingml/2006/main" xmlns:pic="http://schemas.openxmlformats.org/drawingml/2006/picture">
-                  <wp:extent cx="2476195" cy="2476195"/>
-                  <wp:docPr id="4" name="Picture 4"/>
-                  <wp:cNvGraphicFramePr>
-                    <a:graphicFrameLocks noChangeAspect="1"/>
-                  </wp:cNvGraphicFramePr>
-                  <a:graphic>
-                    <a:graphicData uri="http://schemas.openxmlformats.org/drawingml/2006/picture">
-                      <pic:pic>
-                        <pic:nvPicPr>
-                          <pic:cNvPr id="0" name="CRA.ST605.3212-3230_2025.014_1.jpg"/>
-                          <pic:cNvPicPr/>
-                        </pic:nvPicPr>
-                        <pic:blipFill>
-                          <a:blip r:embed="rId11"/>
-                          <a:stretch>
-                            <a:fillRect/>
-                          </a:stretch>
-                        </pic:blipFill>
-                        <pic:spPr>
-                          <a:xfrm>
-                            <a:off x="0" y="0"/>
-                            <a:ext cx="2476195" cy="2476195"/>
-                          </a:xfrm>
-                          <a:prstGeom prst="rect"/>
-                        </pic:spPr>
-                      </pic:pic>
-                    </a:graphicData>
-                  </a:graphic>
-                </wp:inline>
-              </w:drawing>
-            </w:r>
-          </w:p>
-        </w:tc>
-        <w:tc>
-          <w:tcPr>
-            <w:tcW w:type="dxa" w:w="5234"/>
-          </w:tcPr>
-          <w:p>
-            <w:pPr>
-              <w:spacing w:before="80" w:after="80"/>
-              <w:ind w:left="0" w:firstLine="0"/>
-              <w:jc w:val="center"/>
-            </w:pPr>
-            <w:r>
-              <w:drawing>
-                <wp:inline xmlns:a="http://schemas.openxmlformats.org/drawingml/2006/main" xmlns:pic="http://schemas.openxmlformats.org/drawingml/2006/picture">
-                  <wp:extent cx="2476195" cy="2476195"/>
-                  <wp:docPr id="5" name="Picture 5"/>
-                  <wp:cNvGraphicFramePr>
-                    <a:graphicFrameLocks noChangeAspect="1"/>
-                  </wp:cNvGraphicFramePr>
-                  <a:graphic>
-                    <a:graphicData uri="http://schemas.openxmlformats.org/drawingml/2006/picture">
-                      <pic:pic>
-                        <pic:nvPicPr>
-                          <pic:cNvPr id="0" name="capa_monitoramento.png"/>
-                          <pic:cNvPicPr/>
-                        </pic:nvPicPr>
-                        <pic:blipFill>
-                          <a:blip r:embed="rId9"/>
-                          <a:stretch>
-                            <a:fillRect/>
-                          </a:stretch>
-                        </pic:blipFill>
-                        <pic:spPr>
-                          <a:xfrm>
-                            <a:off x="0" y="0"/>
-                            <a:ext cx="2476195" cy="2476195"/>
-                          </a:xfrm>
-                          <a:prstGeom prst="rect"/>
-                        </pic:spPr>
-                      </pic:pic>
-                    </a:graphicData>
-                  </a:graphic>
-                </wp:inline>
-              </w:drawing>
-            </w:r>
-          </w:p>
-        </w:tc>
-      </w:tr>
-      <w:tr>
-        <w:tc>
-          <w:tcPr>
-            <w:tcW w:type="dxa" w:w="5234"/>
-          </w:tcPr>
-          <w:p>
-            <w:pPr>
-              <w:spacing w:before="80" w:after="80"/>
-              <w:ind w:left="0" w:firstLine="0"/>
-              <w:jc w:val="both"/>
-            </w:pPr>
-            <w:r>
-              <w:rPr>
-                <w:rFonts w:ascii="Aptos" w:hAnsi="Aptos"/>
-                <w:sz w:val="20"/>
-              </w:rPr>
-              <w:t>Foto 06 – Permanecem as trincas longitudinais (TLL), trincas interligadas com erosão acentuada nas bordas das trincas (JE) e afundamento de trilha de rodas (ATC) na faixa de rolamento direita (14/04/2025).</w:t>
-            </w:r>
-          </w:p>
-        </w:tc>
-        <w:tc>
-          <w:tcPr>
-            <w:tcW w:type="dxa" w:w="5234"/>
-          </w:tcPr>
-          <w:p>
-            <w:pPr>
-              <w:spacing w:before="80" w:after="80"/>
-              <w:ind w:left="0" w:firstLine="0"/>
-              <w:jc w:val="both"/>
-            </w:pPr>
-            <w:r>
-              <w:rPr>
-                <w:rFonts w:ascii="Aptos" w:hAnsi="Aptos"/>
-                <w:sz w:val="20"/>
-              </w:rPr>
-              <w:t>Foto 04 – 3230/2025.014: Trincas longitudinais (TLL), Trincas interligadas e afundamento de trilha de rodas (ATC) no pavimento da faixa de rolamento direita.</w:t>
-            </w:r>
-          </w:p>
-        </w:tc>
-      </w:tr>
-    </w:tbl>
-    <w:p/>
-    <w:p>
-      <w:pPr>
-        <w:spacing w:before="240" w:after="120" w:line="276" w:lineRule="auto"/>
-        <w:jc w:val="both"/>
-      </w:pPr>
-      <w:r>
-        <w:rPr>
-          <w:rFonts w:ascii="Aptos" w:hAnsi="Aptos"/>
-          <w:b/>
-          <w:sz w:val="22"/>
-        </w:rPr>
-        <w:t>CRA.ST607.3550-3562 /2025.015 – RODOVIA ESTADUAL PE - 009 – CRA.ST607.3550-3562 /2025.015</w:t>
-      </w:r>
-    </w:p>
-    <w:tbl>
-      <w:tblPr>
-        <w:tblStyle w:val="TableGrid"/>
-        <w:tblW w:type="auto" w:w="0"/>
-        <w:jc w:val="center"/>
-        <w:tblLayout w:type="fixed"/>
-        <w:tblLook w:firstColumn="1" w:firstRow="1" w:lastColumn="0" w:lastRow="0" w:noHBand="0" w:noVBand="1" w:val="04A0"/>
-      </w:tblPr>
-      <w:tblGrid>
-        <w:gridCol w:w="5234"/>
-        <w:gridCol w:w="5234"/>
-      </w:tblGrid>
-      <w:tr>
-        <w:tc>
-          <w:tcPr>
-            <w:tcW w:type="dxa" w:w="5234"/>
-          </w:tcPr>
-          <w:p>
-            <w:pPr>
-              <w:spacing w:before="80" w:after="80"/>
-              <w:ind w:left="0" w:firstLine="0"/>
-              <w:jc w:val="center"/>
-            </w:pPr>
-            <w:r>
-              <w:drawing>
-                <wp:inline xmlns:a="http://schemas.openxmlformats.org/drawingml/2006/main" xmlns:pic="http://schemas.openxmlformats.org/drawingml/2006/picture">
-                  <wp:extent cx="2476195" cy="2476195"/>
-                  <wp:docPr id="6" name="Picture 6"/>
-                  <wp:cNvGraphicFramePr>
-                    <a:graphicFrameLocks noChangeAspect="1"/>
-                  </wp:cNvGraphicFramePr>
-                  <a:graphic>
-                    <a:graphicData uri="http://schemas.openxmlformats.org/drawingml/2006/picture">
-                      <pic:pic>
-                        <pic:nvPicPr>
-                          <pic:cNvPr id="0" name="CRA.ST607.3550-3562 _2025.015_1.jpg"/>
-                          <pic:cNvPicPr/>
-                        </pic:nvPicPr>
-                        <pic:blipFill>
-                          <a:blip r:embed="rId12"/>
-                          <a:stretch>
-                            <a:fillRect/>
-                          </a:stretch>
-                        </pic:blipFill>
-                        <pic:spPr>
-                          <a:xfrm>
-                            <a:off x="0" y="0"/>
-                            <a:ext cx="2476195" cy="2476195"/>
-                          </a:xfrm>
-                          <a:prstGeom prst="rect"/>
-                        </pic:spPr>
-                      </pic:pic>
-                    </a:graphicData>
-                  </a:graphic>
-                </wp:inline>
-              </w:drawing>
-            </w:r>
-          </w:p>
-        </w:tc>
-        <w:tc>
-          <w:tcPr>
-            <w:tcW w:type="dxa" w:w="5234"/>
-          </w:tcPr>
-          <w:p>
-            <w:pPr>
-              <w:spacing w:before="80" w:after="80"/>
-              <w:ind w:left="0" w:firstLine="0"/>
-              <w:jc w:val="center"/>
-            </w:pPr>
-            <w:r>
-              <w:drawing>
-                <wp:inline xmlns:a="http://schemas.openxmlformats.org/drawingml/2006/main" xmlns:pic="http://schemas.openxmlformats.org/drawingml/2006/picture">
-                  <wp:extent cx="2476195" cy="2476195"/>
-                  <wp:docPr id="7" name="Picture 7"/>
-                  <wp:cNvGraphicFramePr>
-                    <a:graphicFrameLocks noChangeAspect="1"/>
-                  </wp:cNvGraphicFramePr>
-                  <a:graphic>
-                    <a:graphicData uri="http://schemas.openxmlformats.org/drawingml/2006/picture">
-                      <pic:pic>
-                        <pic:nvPicPr>
-                          <pic:cNvPr id="0" name="capa_monitoramento.png"/>
-                          <pic:cNvPicPr/>
-                        </pic:nvPicPr>
-                        <pic:blipFill>
-                          <a:blip r:embed="rId9"/>
-                          <a:stretch>
-                            <a:fillRect/>
-                          </a:stretch>
-                        </pic:blipFill>
-                        <pic:spPr>
-                          <a:xfrm>
-                            <a:off x="0" y="0"/>
-                            <a:ext cx="2476195" cy="2476195"/>
-                          </a:xfrm>
-                          <a:prstGeom prst="rect"/>
-                        </pic:spPr>
-                      </pic:pic>
-                    </a:graphicData>
-                  </a:graphic>
-                </wp:inline>
-              </w:drawing>
-            </w:r>
-          </w:p>
-        </w:tc>
-      </w:tr>
-      <w:tr>
-        <w:tc>
-          <w:tcPr>
-            <w:tcW w:type="dxa" w:w="5234"/>
-          </w:tcPr>
-          <w:p>
-            <w:pPr>
-              <w:spacing w:before="80" w:after="80"/>
-              <w:ind w:left="0" w:firstLine="0"/>
-              <w:jc w:val="both"/>
-            </w:pPr>
-            <w:r>
-              <w:rPr>
-                <w:rFonts w:ascii="Aptos" w:hAnsi="Aptos"/>
-                <w:sz w:val="20"/>
-              </w:rPr>
-              <w:t>Foto 08 – Serviços em execução para a recuperação da segunda junta de dilatação na via sobre o cruzamento com a PE 028 (14/04/2026).</w:t>
-            </w:r>
-          </w:p>
-        </w:tc>
-        <w:tc>
-          <w:tcPr>
-            <w:tcW w:type="dxa" w:w="5234"/>
-          </w:tcPr>
-          <w:p>
-            <w:pPr>
-              <w:spacing w:before="80" w:after="80"/>
-              <w:ind w:left="0" w:firstLine="0"/>
-              <w:jc w:val="both"/>
-            </w:pPr>
-            <w:r>
-              <w:rPr>
-                <w:rFonts w:ascii="Aptos" w:hAnsi="Aptos"/>
-                <w:sz w:val="20"/>
-              </w:rPr>
-              <w:t>Foto 06 – 3562 /2025.015: Pavimento sobre a Junta de dilatação na via sobre o cruzamento com a PE 028 deteriorado e com falhas que possibilitam infiltrações.</w:t>
-            </w:r>
-          </w:p>
-        </w:tc>
-      </w:tr>
-    </w:tbl>
-    <w:p/>
     <w:sectPr>
       <w:pgSz w:w="11909" w:h="16834"/>
       <w:pgMar w:top="720" w:right="720" w:bottom="720" w:left="720" w:header="720" w:footer="720" w:gutter="0"/>

</xml_diff>